<commit_message>
Update AI-102 courseware and assessments
</commit_message>
<xml_diff>
--- a/courseware/LP-Microsoft Certified Azure AI Engineer Associate AI-102 Training.docx
+++ b/courseware/LP-Microsoft Certified Azure AI Engineer Associate AI-102 Training.docx
@@ -1127,7 +1127,7 @@
                 <w:color w:val="111827"/>
                 <w:sz w:val="18"/>
               </w:rPr>
-              <w:t>17-21</w:t>
+              <w:t>17-26</w:t>
             </w:r>
           </w:p>
         </w:tc>
@@ -1275,7 +1275,7 @@
                 <w:color w:val="111827"/>
                 <w:sz w:val="18"/>
               </w:rPr>
-              <w:t>22-26</w:t>
+              <w:t>27-36</w:t>
             </w:r>
           </w:p>
         </w:tc>
@@ -1349,7 +1349,7 @@
                 <w:color w:val="111827"/>
                 <w:sz w:val="18"/>
               </w:rPr>
-              <w:t>27-31</w:t>
+              <w:t>37-46</w:t>
             </w:r>
           </w:p>
         </w:tc>
@@ -1423,7 +1423,7 @@
                 <w:color w:val="111827"/>
                 <w:sz w:val="18"/>
               </w:rPr>
-              <w:t>27-31</w:t>
+              <w:t>37-46</w:t>
             </w:r>
           </w:p>
         </w:tc>
@@ -1571,7 +1571,7 @@
                 <w:color w:val="111827"/>
                 <w:sz w:val="18"/>
               </w:rPr>
-              <w:t>32-36</w:t>
+              <w:t>47-56</w:t>
             </w:r>
           </w:p>
         </w:tc>
@@ -1645,7 +1645,7 @@
                 <w:color w:val="111827"/>
                 <w:sz w:val="18"/>
               </w:rPr>
-              <w:t>37-41</w:t>
+              <w:t>57-66</w:t>
             </w:r>
           </w:p>
         </w:tc>
@@ -1793,7 +1793,7 @@
                 <w:color w:val="111827"/>
                 <w:sz w:val="18"/>
               </w:rPr>
-              <w:t>42-46</w:t>
+              <w:t>67-76</w:t>
             </w:r>
           </w:p>
         </w:tc>
@@ -1867,7 +1867,7 @@
                 <w:color w:val="111827"/>
                 <w:sz w:val="18"/>
               </w:rPr>
-              <w:t>42-46</w:t>
+              <w:t>67-76</w:t>
             </w:r>
           </w:p>
         </w:tc>
@@ -1941,7 +1941,7 @@
                 <w:color w:val="111827"/>
                 <w:sz w:val="18"/>
               </w:rPr>
-              <w:t>47</w:t>
+              <w:t>77</w:t>
             </w:r>
           </w:p>
         </w:tc>
@@ -2015,7 +2015,7 @@
                 <w:color w:val="111827"/>
                 <w:sz w:val="18"/>
               </w:rPr>
-              <w:t>48-52</w:t>
+              <w:t>78-87</w:t>
             </w:r>
           </w:p>
         </w:tc>
@@ -2163,7 +2163,7 @@
                 <w:color w:val="111827"/>
                 <w:sz w:val="18"/>
               </w:rPr>
-              <w:t>53-57</w:t>
+              <w:t>88-97</w:t>
             </w:r>
           </w:p>
         </w:tc>
@@ -2237,7 +2237,7 @@
                 <w:color w:val="111827"/>
                 <w:sz w:val="18"/>
               </w:rPr>
-              <w:t>58-62</w:t>
+              <w:t>98-107</w:t>
             </w:r>
           </w:p>
         </w:tc>
@@ -2385,7 +2385,7 @@
                 <w:color w:val="111827"/>
                 <w:sz w:val="18"/>
               </w:rPr>
-              <w:t>63-67</w:t>
+              <w:t>108-118</w:t>
             </w:r>
           </w:p>
         </w:tc>
@@ -2681,7 +2681,7 @@
                 <w:color w:val="111827"/>
                 <w:sz w:val="18"/>
               </w:rPr>
-              <w:t>68-73</w:t>
+              <w:t>119-124</w:t>
             </w:r>
           </w:p>
         </w:tc>
@@ -2851,7 +2851,7 @@
                 <w:color w:val="111827"/>
                 <w:sz w:val="18"/>
               </w:rPr>
-              <w:t>17-21</w:t>
+              <w:t>17-26</w:t>
             </w:r>
           </w:p>
         </w:tc>
@@ -2925,7 +2925,7 @@
                 <w:color w:val="111827"/>
                 <w:sz w:val="18"/>
               </w:rPr>
-              <w:t>22-26</w:t>
+              <w:t>27-36</w:t>
             </w:r>
           </w:p>
         </w:tc>
@@ -2999,7 +2999,7 @@
                 <w:color w:val="111827"/>
                 <w:sz w:val="18"/>
               </w:rPr>
-              <w:t>27-31</w:t>
+              <w:t>37-46</w:t>
             </w:r>
           </w:p>
         </w:tc>
@@ -3073,7 +3073,7 @@
                 <w:color w:val="111827"/>
                 <w:sz w:val="18"/>
               </w:rPr>
-              <w:t>32-36</w:t>
+              <w:t>47-56</w:t>
             </w:r>
           </w:p>
         </w:tc>
@@ -3147,7 +3147,7 @@
                 <w:color w:val="111827"/>
                 <w:sz w:val="18"/>
               </w:rPr>
-              <w:t>37-41</w:t>
+              <w:t>57-66</w:t>
             </w:r>
           </w:p>
         </w:tc>
@@ -3221,7 +3221,7 @@
                 <w:color w:val="111827"/>
                 <w:sz w:val="18"/>
               </w:rPr>
-              <w:t>42-46</w:t>
+              <w:t>67-76</w:t>
             </w:r>
           </w:p>
         </w:tc>
@@ -3295,7 +3295,7 @@
                 <w:color w:val="111827"/>
                 <w:sz w:val="18"/>
               </w:rPr>
-              <w:t>48-52</w:t>
+              <w:t>78-87</w:t>
             </w:r>
           </w:p>
         </w:tc>
@@ -3369,7 +3369,7 @@
                 <w:color w:val="111827"/>
                 <w:sz w:val="18"/>
               </w:rPr>
-              <w:t>53-57</w:t>
+              <w:t>88-97</w:t>
             </w:r>
           </w:p>
         </w:tc>
@@ -3443,7 +3443,7 @@
                 <w:color w:val="111827"/>
                 <w:sz w:val="18"/>
               </w:rPr>
-              <w:t>58-62</w:t>
+              <w:t>98-107</w:t>
             </w:r>
           </w:p>
         </w:tc>
@@ -3517,7 +3517,7 @@
                 <w:color w:val="111827"/>
                 <w:sz w:val="18"/>
               </w:rPr>
-              <w:t>63-67</w:t>
+              <w:t>108-118</w:t>
             </w:r>
           </w:p>
         </w:tc>

</xml_diff>